<commit_message>
Add EMI placement data and Q1 paper draft; update Cambridge FRP and literature notes.
Made-with: Cursor
</commit_message>
<xml_diff>
--- a/Cambridge project/FRP_R14_MAltay.docx
+++ b/Cambridge project/FRP_R14_MAltay.docx
@@ -35,7 +35,7 @@
     </w:p>
     <w:p>
       <w:r>
-        <w:t>This proposal responds to the Round 14 theme of exploring emerging constructs in language assessment by operationalising “construct-relevant process evidence” alongside product scores. Rather than treating comprehension as a single latent trait inferred only from item responses, the project models reading as a dynamic interaction among text features, learner profiles, and moment-to-moment processing behaviours that can be indexed through eye-movement metrics and responsiveness to calibrated mediation. The design therefore targets construct representation and explanatory fairness in digital reading assessment: it connects observable processing signatures to adaptive scaffolding aligned with the Zone of Proximal Development (ZPD), supporting more inclusive inferences for diverse EFL readers.</w:t>
+        <w:t>This proposal addresses Round 14 priorities around emerging constructs and digitally mediated assessment by modelling reading comprehension as jointly evidenced by (a) product scores, (b) traceable processing behaviours, and (c) responsiveness to calibrated mediation. Rather than treating comprehension as a single latent trait inferred only from item responses, the study articulates how moment-to-moment allocation of attention—indexed through eye-movement parameters—can inform which scaffolding is triggered for which learner on which item type. The design therefore targets explanatory fairness: it links observable processing signatures to adaptive support aligned with the Zone of Proximal Development (ZPD), supporting more equitable inferences for diverse EFL readers when digital tests risk under-representing emerging abilities (McNamara, 2014; Poehner &amp; Wang, 2021).</w:t>
       </w:r>
     </w:p>
     <w:p>
@@ -48,16 +48,22 @@
     </w:p>
     <w:p>
       <w:r>
-        <w:t>Over a decade ago, McNamara (2014) argued that language assessment was facing a moment of crisis, driven by technological advances and shifting communicative realities. Today, that call for re-evaluation is more urgent. As educational landscapes evolve, assessment must move from static snapshots toward innovative, inclusive practices that reflect the complexity of learning. A productive framework is Vygotskyan Dynamic Assessment (DA), which reconceptualises testing and teaching as a single, dialectically integrated activity (Lantolf &amp; Poehner, 2010; Poehner &amp; Wang, 2021). Rooted in sociocultural theory and the ZPD, DA integrates assessment and instruction so that the goal is not only to measure independent performance but to evaluate emerging abilities through cooperative mediation (Poehner &amp; Lantolf, 2005). In EFL reading comprehension, DA identifies where a reader struggles and provides immediate, calibrated support.</w:t>
+        <w:t>McNamara (2014) argued that language assessment must confront technological change and shifting communicative realities; digital delivery now makes process capture feasible at scale, reopening questions about what should count as evidence in reading assessment. Two research programmes are especially relevant.</w:t>
         <w:br/>
         <w:br/>
-        <w:t>Historically, DA divides into Interactionist and Interventionist traditions (Lantolf &amp; Poehner, 2004). Interactionist DA is highly responsive but labour-intensive; Interventionist DA scales through standardised prompts. Computerised formats (C-DA) extend Interventionist models to larger cohorts (Poehner et al., 2015). Recent work on hybrid computerised DA further shows how principled mediation design can combine interactionist insights with scalable delivery in L2 reading contexts (Jin &amp; Liu, 2024). However, conventional C-DA still largely delivers fixed mediation sequences and therefore under-uses information about how individual learners process text in real time.</w:t>
+        <w:t>Eye-tracking and process-oriented validity in language testing. Eye-movement recording has become a standard complement to outcome scores when researchers ask whether tests elicit the cognitive processes their constructs imply (Bax, 2013). In high-stakes reading assessment, process evidence can support validity arguments by describing how candidates allocate attention across text and items (Lim, 2020). Related work shows how individual differences interact with gaze during L2 reading-for-testing tasks (Tywoniw, 2023). Eye-tracking has also been applied beyond reading-for-comprehension screens—for example to analyse attention to visual cues in L2 listening tests (Batty, 2020)—illustrating how process data can be embedded in computer-delivered tasks more broadly. Syntheses and introductions in second language research position eye-tracking as a method that increasingly pairs with other evidence sources and with interdisciplinary tooling (Godfroid, Winke, &amp; Conklin, 2020). A recent review maps the growth of eye-tracking research in L2 assessment and foregrounds cognitive validity and processing patterns among recurring themes (Cao &amp; Ma, 2025). Across these lines of work, gaze indices are typically treated as auxiliary evidence that constrains interpretation of performance rather than as standalone proficiency scores.</w:t>
         <w:br/>
         <w:br/>
-        <w:t>Eye-tracking provides millisecond-level evidence of allocation of attention during reading and has become a mainstream complement to outcome measures in second language research (Godfroid, Winke, &amp; Conklin, 2020). Large-scale corpora such as MECO L2 also demonstrate substantial heterogeneity in the determinants of L2 reading fluency versus comprehension accuracy across diverse L1 backgrounds, underscoring the need for assessment models that recognise multiple reader profiles rather than a single developmental pathway (Kuperman et al., 2023). Integrating eye-movement features with reader profiles therefore offers a credible route toward adaptive mediation without requiring continuous human–learner dialogues.</w:t>
+        <w:t>Dynamic assessment and technology-mediated mediation. Sociocultural Dynamic Assessment (DA) integrates assessment and instruction so that the aim includes estimating emerging abilities through cooperative mediation (Lantolf &amp; Poehner, 2010; Poehner &amp; Lantolf, 2005). Computerised Dynamic Assessment (C-DA) scales interventionist mediation through graduated prompts and yields multi-index profiles of responsiveness (Poehner, Zhang, &amp; Lu, 2015; Zhang &amp; Lu, 2019). Contemporary accounts emphasise DA’s relevance to digital ecologies and to diagnosing development during mediation (Poehner &amp; Wang, 2021). Recent classroom-oriented implementations further demonstrate how hybrid computerised DA can combine interactionist insights with scalable delivery in L2 reading contexts (Jin &amp; Liu, 2024). However, many C-DA systems still deliver largely fixed mediation ladders and therefore under-use continuous evidence about how a learner is processing the text at hand.</w:t>
         <w:br/>
         <w:br/>
-        <w:t>From a validity standpoint, the proposal treats process data as auxiliary evidence that constrains interpretation of mediated performance: gaze indices are not proposed as standalone proficiency scores, but as evidence that helps explain why particular mediations are warranted for particular learners on particular items. This distinction matters for programme priorities around fairness and transparency in digital assessment, where claims about “emerging abilities” should be traceable to observable behaviours and principled mediation rules (Poehner &amp; Wang, 2021).</w:t>
+        <w:t>Heterogeneity in L2 reading. Large-scale eye-movement corpora underscore that predictors of fluency and comprehension need not align uniformly across multilingual readers (Kuperman et al., 2023), motivating profile-sensitive assessment designs. Reader profiles tied to competence and motivational–cognitive resources provide stable priors for interpreting gaze (Alexander, 2005; Dinsmore et al., 2018).</w:t>
+        <w:br/>
+        <w:br/>
+        <w:t>Synthesis. The project integrates process-oriented validity logic from eye-tracking research in language testing with technology-mediated DA: real-time indices of processing difficulty become inputs to mediation selection, while outcome and mediation traces remain primary evidentiary objects.</w:t>
+        <w:br/>
+        <w:br/>
+        <w:t>Literature sources informing this synthesis were identified through Web of Science Core Collection searches (e.g., topic queries pairing computerised dynamic assessment with reading/L2; eye tracking with language testing) and supplemented with publisher metadata (Crossref) for DOI-verified citations. Complementary discovery in Google Scholar and ResearchGate was used to confirm bibliographic details for handbooks and recent CALL articles where needed.</w:t>
       </w:r>
     </w:p>
     <w:p>
@@ -70,10 +76,10 @@
     </w:p>
     <w:p>
       <w:r>
-        <w:t>A critical gap separates the scalability of Interventionist C-DA from the responsiveness of Interactionist DA. Current platforms rarely use continuous process evidence to adapt mediation; cues typically follow predetermined ladders. Parallel gaps exist between product-only scoring and construct-relevant process data that can explain why a response is (in)correct for a given learner.</w:t>
+        <w:t>Three gaps motivate Adaptive Interventionist Dynamic Assessment (A-IDA). First, scalable Interventionist C-DA trades away moment-to-moment responsiveness: mediation is typically pre-sequenced rather than conditional on ongoing comprehension signals. Second, although eye-tracking has been used to evaluate tests and tasks, fewer implementations close the loop by using gaze features to adapt scaffolding inside the assessment session itself. Third, product-only scoring leaves explanatory gaps when learners with different profiles produce similar scores or when scores understate emerging ability.</w:t>
         <w:br/>
         <w:br/>
-        <w:t>This project proposes Adaptive Interventionist Dynamic Assessment (A-IDA): a synthesis in which eye-tracking metrics and reader-profile classifications jointly trigger individualised scaffolding during computerised reading tests. The objective is to approximate the diagnostic richness of interactionist mediation within a scalable workflow suitable for empirical comparison against traditional C-DA and non-mediated control conditions.</w:t>
+        <w:t>A-IDA targets a synthesis: eye-tracking metrics and reader-profile classifications jointly trigger individualised scaffolding during computerised reading, enabling empirical comparison against traditional C-DA and a non-mediated control.</w:t>
       </w:r>
     </w:p>
     <w:p>
@@ -92,7 +98,7 @@
         <w:t>2. How do comprehension outcomes and response times vary across reader profiles (e.g., highly competent, effortful, challenged) under A-IDA compared with traditional C-DA?</w:t>
         <w:br/>
         <w:br/>
-        <w:t>3. What relationships obtain between eye-movement parameters (e.g., fixation measures, regressive saccades) and the type and frequency of scaffolding cues triggered during testing?</w:t>
+        <w:t>3. What relationships obtain between eye-movement parameters (e.g., fixation-based difficulty proxies, regressive saccades) and the type and frequency of scaffolding cues triggered during testing?</w:t>
       </w:r>
     </w:p>
     <w:p>
@@ -105,13 +111,13 @@
     </w:p>
     <w:p>
       <w:r>
-        <w:t>The study follows design-based research (DBR) using the ADDIE cycle (Analysis, Design, Development, Implementation, Evaluation) to build, pilot, and refine A-IDA across iterative micro-cycles. DBR is appropriate because the artefact (an adaptive testing interface) and its instrumentation are co-developed with evidence from authentic learner use (McNamara, 2014; Poehner &amp; Wang, 2021).</w:t>
+        <w:t>The study follows design-based research (DBR) using the ADDIE cycle (Analysis, Design, Development, Implementation, Evaluation) to build, pilot, and refine A-IDA across iterative micro-cycles. DBR fits because the artefact (an adaptive testing interface) and its instrumentation co-evolve with evidence from learner use (McNamara, 2014; Poehner &amp; Wang, 2021).</w:t>
         <w:br/>
         <w:br/>
-        <w:t>Figure 1 summarises the processing architecture. In live operation, gaze streams are segmented into fixations and saccades; features feed a profile-aware decision layer that selects mediation from a validated bank mapped to item-level skills (e.g., inferencing, cohesion). This figure should appear as a simple flowchart in the final Word file (Insert → SmartArt → Process, or an exported diagram from your design tool).</w:t>
+        <w:t>Figure 1 summarises the processing architecture. In live operation, gaze streams are segmented into fixations and saccades; derived features feed a profile-aware decision layer that selects mediation from a validated bank mapped to item-level skills (e.g., inferencing, cohesion). Insert Figure 1 in Word as a flowchart (Insert → SmartArt → Process, or an exported diagram).</w:t>
         <w:br/>
         <w:br/>
-        <w:t>Table 1 outlines a 12-month timeline aligned to the programme window (December 2026–December 2027). Months are indicative; exact dates will be anchored to institutional calendars and ethics approval.</w:t>
+        <w:t>Table 1 outlines a 12-month timeline aligned to the programme window (December 2026–December 2027). Exact months will be adjusted for ethics approval and term dates.</w:t>
       </w:r>
     </w:p>
     <w:p/>
@@ -195,7 +201,7 @@
           </w:tcPr>
           <w:p>
             <w:r>
-              <w:t>Needs analysis; risk register; mediation taxonomy draft</w:t>
+              <w:t>Needs analysis; risk register; mediation taxonomy v0</w:t>
             </w:r>
           </w:p>
         </w:tc>
@@ -237,7 +243,7 @@
           </w:tcPr>
           <w:p>
             <w:r>
-              <w:t>Wireframes; cue database v1; pilot items; preregistration plan</w:t>
+              <w:t>Wireframes; cue database v1; pilot battery; analysis preregistration</w:t>
             </w:r>
           </w:p>
         </w:tc>
@@ -247,7 +253,7 @@
           </w:tcPr>
           <w:p>
             <w:r>
-              <w:t>Expert panel review (n = 5)</w:t>
+              <w:t>Expert review (n = 5)</w:t>
             </w:r>
           </w:p>
         </w:tc>
@@ -279,7 +285,7 @@
           </w:tcPr>
           <w:p>
             <w:r>
-              <w:t>EyeLink–PsychoPy/PyQt integration; real-time feature pipeline; classifier v1</w:t>
+              <w:t>EyeLink–PsychoPy/PyQt integration; online feature pipeline; rules v1</w:t>
             </w:r>
           </w:p>
         </w:tc>
@@ -289,7 +295,7 @@
           </w:tcPr>
           <w:p>
             <w:r>
-              <w:t>Latency benchmarks; debugging logs</w:t>
+              <w:t>Latency; reliability of gaze features</w:t>
             </w:r>
           </w:p>
         </w:tc>
@@ -321,7 +327,7 @@
           </w:tcPr>
           <w:p>
             <w:r>
-              <w:t>Pilot (n ≈ 20–30); refine mediation rules</w:t>
+              <w:t>Pilot (n ≈ 20–30); tune thresholds</w:t>
             </w:r>
           </w:p>
         </w:tc>
@@ -331,7 +337,7 @@
           </w:tcPr>
           <w:p>
             <w:r>
-              <w:t>Usability; mediation validity checks</w:t>
+              <w:t>Usability; cue–item alignment</w:t>
             </w:r>
           </w:p>
         </w:tc>
@@ -363,7 +369,7 @@
           </w:tcPr>
           <w:p>
             <w:r>
-              <w:t>Main study; analysis; report; dissemination package</w:t>
+              <w:t>Main study; analysis; reporting; handover pack</w:t>
             </w:r>
           </w:p>
         </w:tc>
@@ -373,7 +379,7 @@
           </w:tcPr>
           <w:p>
             <w:r>
-              <w:t>Effect sizes; process–outcome models</w:t>
+              <w:t>Effects; process–outcome models</w:t>
             </w:r>
           </w:p>
         </w:tc>
@@ -382,7 +388,7 @@
     <w:p/>
     <w:p>
       <w:r>
-        <w:t>Figure 1. A-IDA live cycle: gaze acquisition → event detection (fixations, regressions) → profile-aware mediation selection → delivery via the testing UI → logged outcomes for analysis.</w:t>
+        <w:t>Figure 1. A-IDA cycle: gaze acquisition → event detection (fixations, regressions) → profile-aware mediation selection → delivery via the testing UI → logged outcomes for analysis.</w:t>
       </w:r>
     </w:p>
     <w:p>
@@ -403,7 +409,7 @@
     </w:p>
     <w:p>
       <w:r>
-        <w:t>Eye-tracking is included because it captures how comprehension unfolds, not only whether an item is answered correctly (Godfroid, Winke, &amp; Conklin, 2020). Fixation- and regression-based features provide proxies for difficulty and strategic reanalysis that can be computed within trial windows compatible with mediated items. Profile classification (Alexander, 2005; Dinsmore et al., 2018) supplies stable priors that prevent overfitting idiosyncratic noise in gaze data. The learning potential score (LPS) framework remains appropriate because it quantifies responsiveness to mediation relative to unassisted performance (Poehner et al., 2015). Finally, scikit-learn decision rules offer an interpretable first-generation mapping from features to mediation levels—transparent to auditors and teachers—while remaining fast enough for classroom/lab deployment; more complex models can be explored in later iterations once trace data are logged.</w:t>
+        <w:t>Eye-tracking is included because it captures how comprehension unfolds during test completion, aligning with process-oriented validity arguments in language testing research (Bax, 2013; Godfroid, Winke, &amp; Conklin, 2020; Lim, 2020). Fixation- and regression-based features provide proxies for difficulty and strategic reanalysis within trial windows compatible with mediated items. Profile classification (Alexander, 2005; Dinsmore et al., 2018) supplies priors that reduce overfitting idiosyncratic gaze noise. The learning potential score (LPS) family remains appropriate because it indexes responsiveness to mediation relative to unassisted performance (Poehner et al., 2015; Zhang &amp; Lu, 2019). Scikit-learn decision rules offer an interpretable first-generation mapping from features to mediation levels—auditable for stakeholders—before more complex models are considered once trace datasets exist.</w:t>
       </w:r>
     </w:p>
     <w:p>
@@ -416,7 +422,7 @@
     </w:p>
     <w:p>
       <w:r>
-        <w:t>Participants will be EFL undergraduates enrolled in English-medium coursework at a public university in Türkiye. A vocabulary-size screening will target intermediate–upper intermediate readers (approximately 5,000–6,000 word families) to align texts with Cambridge-level tasks. Reader profiles will be operationalised using the Alexander (2005) competence framework as informed by interest/prior knowledge indicators (Dinsmore et al., 2018). Target recruitment for the main phase is approximately 60–90 participants (20–30 per arm), with a preceding pilot to stabilise mediation thresholds. The team includes applied linguists/assessment researchers and a software engineer responsible for the adaptive interface, aligning with Jin and Liu’s (2024) emphasis on principled mediation design in computerised DA.</w:t>
+        <w:t>Participants will be EFL undergraduates in English-medium programmes at a public university in Türkiye. Vocabulary screening will target intermediate–upper intermediate readers (approximately 5,000–6,000 word families) to align with Cambridge-level tasks. Reader profiles will follow Alexander (2005) as informed by interest and prior knowledge (Dinsmore et al., 2018). Target recruitment is approximately 60–90 participants (20–30 per arm), preceded by a pilot to stabilise mediation thresholds. The team combines applied linguists/assessment researchers with a software engineer for the adaptive interface—consistent with principled mediation design in computerised DA (Jin &amp; Liu, 2024).</w:t>
       </w:r>
     </w:p>
     <w:p>
@@ -429,10 +435,10 @@
     </w:p>
     <w:p>
       <w:r>
-        <w:t>Reading materials and items will be drawn from validated Cambridge English examinations (e.g., B2 First, C1 Advanced, or IELTS Academic reading), ensuring construct alignment with Cambridge constructs and score interpretations. An expert panel (five applied linguists) will review text–mediation coupling before pilots.</w:t>
+        <w:t>Reading materials and items will be drawn from validated Cambridge English examinations (e.g., B2 First, C1 Advanced, or IELTS Academic reading), supporting alignment with Cambridge constructs. An expert panel (five applied linguists) will review text–mediation mapping before pilots.</w:t>
         <w:br/>
         <w:br/>
-        <w:t>Eye-tracking will use the SR Research EyeLink Portable Duo already available in the lab. The software stack (pylink, PsychoPy, PyQt5; NumPy/Pandas for online feature extraction) prioritises timing fidelity and reproducibility. Mediation banks will follow graduated prompting consistent with Interventionist DA while allowing profile-conditioned branches—an implementation parallel to hybrid C-DA rationales (Jin &amp; Liu, 2024).</w:t>
+        <w:t>Eye-tracking will use the SR Research EyeLink Portable Duo available in the lab. The stack (pylink, PsychoPy, PyQt5; NumPy/Pandas for online features) prioritises timing fidelity. Mediation banks follow graduated prompting while allowing profile-conditioned branches (Jin &amp; Liu, 2024; Poehner et al., 2015).</w:t>
       </w:r>
     </w:p>
     <w:p>
@@ -445,16 +451,16 @@
     </w:p>
     <w:p>
       <w:r>
-        <w:t>Participants will be randomly assigned to A-IDA, standard C-DA, or control. Dependent variables include accuracy, response time, mediation level required, and LPS contrasts. Omnibus tests (e.g., one-way ANOVA or robust alternatives if assumptions fail) will compare arms; exploratory moderation by reader profile will use factorial or regression models; relationships between gaze features and mediation will be examined via correlational and regression frameworks, with multiple-comparison control as appropriate.</w:t>
+        <w:t>Participants will be randomly assigned to A-IDA, standard C-DA, or control. Dependent variables include accuracy, response time, mediation level, and LPS contrasts. Omnibus comparisons (e.g., one-way ANOVA or robust alternatives) will contrast arms; moderation by reader profile will use factorial or regression models; gaze–mediation relations will use correlational/regression frameworks with multiple-comparison control as appropriate. Effect sizes and confidence intervals will be reported alongside p-values.</w:t>
         <w:br/>
         <w:br/>
-        <w:t>Ethics: institutional ethics approval, informed consent, right to withdraw, secure storage of gaze and behavioural logs, and clear protocols for incidental findings. Data management will follow least-privilege access and pseudonymised identifiers.</w:t>
+        <w:t>Ethics: institutional approval, informed consent, withdrawal rights, secure storage of logs, protocols for incidental findings. Data access will follow least privilege and pseudonymised identifiers.</w:t>
         <w:br/>
         <w:br/>
-        <w:t>Limitations and delimitations: eye-tracking requires laboratory-quality calibration; findings will generalise first to similar proficiency bands and task types rather than all Cambridge products. Mediation rules will be versioned (A-IDA v1) to support replication. Finally, while the decision layer begins with interpretable rules, future work may explore richer sequence models under strict governance for high-stakes use.</w:t>
+        <w:t>Open-science practices: the team will preregister the main confirmatory analysis plan (e.g., OSF) before the main data collection window, specifying primary contrasts, planned contrasts or simple effects for profiles, and rules for handling outliers and missing gaze segments. Materials that can be shared without violating Cambridge item copyright will be documented in a replication packet.</w:t>
         <w:br/>
         <w:br/>
-        <w:t>Transparency outputs: alongside peer-targeted dissemination, the team will prepare a mediation codebook (cue functions, triggering thresholds, and profile logic), anonymised analysis scripts, and a summary of alignment between gaze features and item-level skills. Where copyright permits, de-identified process aggregates may be shared to support secondary analysis; otherwise, synthetic illustrations will document the approach for Cambridge stakeholders.</w:t>
+        <w:t>Limitations: laboratory calibration requirements; generalisation initially to similar proficiency bands and task types; mediation rules versioned as A-IDA v1 for replication. Transparency: mediation codebook, analysis scripts, and (where copyright permits) aggregated process summaries for Cambridge stakeholders.</w:t>
       </w:r>
     </w:p>
     <w:p>
@@ -467,10 +473,10 @@
     </w:p>
     <w:p>
       <w:r>
-        <w:t>For Cambridge English, the project offers a research pathway toward digital assessments and learning products that combine high-quality items with transparent, profile-sensitive feedback—supporting fairness arguments where learners differ in processing signatures yet demonstrate similar emerging abilities when appropriately mediated. Because materials come from Cambridge examinations, results can speak directly to how diverse profiles engage with existing tasks, informing future item development and automated tutoring overlays. If process-sensitive mediation improves score meaning without inflating construct-irrelevant variance, the model also aligns with programme interests in assessment for learning and responsible innovation in computer-delivered testing.</w:t>
+        <w:t>For Cambridge English, the project offers a research pathway toward digital assessments and learning products that pair high-quality items with interpretable, profile-sensitive feedback. Because stimuli come from Cambridge examinations, results can inform how diverse profiles engage with existing tasks—supporting item development, automated tutoring overlays, and transparency in score meaning when mediation is present.</w:t>
         <w:br/>
         <w:br/>
-        <w:t>For the wider field, the work contributes an empirically grounded synthesis of DA, eye-tracking process data, and adaptive testing. It demonstrates how “emerging construct” claims can be evidenced through linked process–product modelling rather than outcome-only inference (cf. Kuperman et al., 2023; Poehner &amp; Wang, 2021). Finally, documenting mediation rules and gaze-derived features advances open, auditable pathways for inclusive assessment design beyond one-size-fits-all adaptive algorithms, including potential transfer of cueing logic to settings where specialised hardware is unavailable (e.g., using simplified behavioural proxies in standard computer-based tests).</w:t>
+        <w:t>For the wider field, the work demonstrates how emerging-construct claims can be supported by linked process–product evidence (cf. Bax, 2013; Kuperman et al., 2023; Poehner &amp; Wang, 2021). Documenting mediation rules and gaze-derived features advances auditable inclusive design beyond fixed adaptive algorithms; later work can explore proxies where eye-tracking hardware is unavailable.</w:t>
       </w:r>
     </w:p>
     <w:p>
@@ -487,6 +493,30 @@
       </w:pPr>
       <w:r>
         <w:t>Alexander, P. A. (2005). The path to competence: A lifespan developmental perspective on reading. Journal of Literacy Research, 37(4), 413–436.</w:t>
+      </w:r>
+    </w:p>
+    <w:p>
+      <w:pPr>
+        <w:ind w:left="360" w:hanging="360"/>
+      </w:pPr>
+      <w:r>
+        <w:t>Bax, S. (2013). The cognitive processing of candidates during reading tests: Evidence from eye-tracking. Language Testing, 30(4), 441–465. https://doi.org/10.1177/0265532212473244</w:t>
+      </w:r>
+    </w:p>
+    <w:p>
+      <w:pPr>
+        <w:ind w:left="360" w:hanging="360"/>
+      </w:pPr>
+      <w:r>
+        <w:t>Batty, A. (2020). An eye-tracking study of attention to visual cues in L2 listening tests. Language Testing, 38(4), 511–535. https://doi.org/10.1177/0265532220951504</w:t>
+      </w:r>
+    </w:p>
+    <w:p>
+      <w:pPr>
+        <w:ind w:left="360" w:hanging="360"/>
+      </w:pPr>
+      <w:r>
+        <w:t>Cao, X., &amp; Ma, Z. (2025). The review on eye-tracking studies in L2 assessment. Colombian Applied Linguistics Journal, 27(2), 51–63. https://doi.org/10.14483/22487085.22043</w:t>
       </w:r>
     </w:p>
     <w:p>
@@ -518,14 +548,6 @@
         <w:ind w:left="360" w:hanging="360"/>
       </w:pPr>
       <w:r>
-        <w:t>Kozulin, A., &amp; Garb, E. (2002). Dynamic assessment of EFL text comprehension. School Psychology International, 23(1), 112–127.</w:t>
-      </w:r>
-    </w:p>
-    <w:p>
-      <w:pPr>
-        <w:ind w:left="360" w:hanging="360"/>
-      </w:pPr>
-      <w:r>
         <w:t>Kuperman, V., Siegelman, N., Schroeder, S., Acartürk, C., Alexeeva, S., Amenta, S., Bertram, R., Bonandrini, R., Brysbaert, M., Chernova, D., Da Fonseca, S. M., Dirix, N., Duyck, W., Fella, A., Frost, R., Gattei, C. A., Kalaitzi, A., Lõo, K., Marelli, M., … Usal, K. A. (2023). Text reading in English as a second language: Evidence from the Multilingual Eye-Movements Corpus. Studies in Second Language Acquisition, 45(1), 3–37. https://doi.org/10.1017/S0272263121000954</w:t>
       </w:r>
     </w:p>
@@ -550,6 +572,14 @@
         <w:ind w:left="360" w:hanging="360"/>
       </w:pPr>
       <w:r>
+        <w:t>Lim, H. (2020). Exploring the validity evidence of a high-stake, second language reading test: An eye-tracking study. Language Testing in Asia, 10, Article 14. https://doi.org/10.1186/s40468-020-00107-0</w:t>
+      </w:r>
+    </w:p>
+    <w:p>
+      <w:pPr>
+        <w:ind w:left="360" w:hanging="360"/>
+      </w:pPr>
+      <w:r>
         <w:t>McNamara, T. (2014). 30 years on—Evolution or revolution? Language Assessment Quarterly, 11(2), 226–232.</w:t>
       </w:r>
     </w:p>
@@ -566,14 +596,6 @@
         <w:ind w:left="360" w:hanging="360"/>
       </w:pPr>
       <w:r>
-        <w:t>Poehner, M. E., &amp; Lantolf, J. P. (2013). Bringing the ZPD into the equation: Capturing L2 development during Computerized Dynamic Assessment (C-DA). Language Teaching Research, 17(3), 323–342.</w:t>
-      </w:r>
-    </w:p>
-    <w:p>
-      <w:pPr>
-        <w:ind w:left="360" w:hanging="360"/>
-      </w:pPr>
-      <w:r>
         <w:t>Poehner, M. E., &amp; Wang, Z. (2021). Dynamic Assessment and second language development. Language Teaching, 54(4), 472–490. https://doi.org/10.1017/S0261444820000555</w:t>
       </w:r>
     </w:p>
@@ -582,7 +604,15 @@
         <w:ind w:left="360" w:hanging="360"/>
       </w:pPr>
       <w:r>
-        <w:t>Poehner, M. E., Zhang, J., &amp; Lu, X. (2015). Computerized dynamic assessment (C-DA): Diagnosing L2 development according to learner responsiveness to mediation. Language Testing, 32(3), 337–357.</w:t>
+        <w:t>Poehner, M. E., Zhang, J., &amp; Lu, X. (2015). Computerized dynamic assessment (C-DA): Diagnosing L2 development according to learner responsiveness to mediation. Language Testing, 32(3), 337–357. https://doi.org/10.1177/0265532214560390</w:t>
+      </w:r>
+    </w:p>
+    <w:p>
+      <w:pPr>
+        <w:ind w:left="360" w:hanging="360"/>
+      </w:pPr>
+      <w:r>
+        <w:t>Tywoniw, R. (2023). Compensatory effects of individual differences, language proficiency, and reading behavior: An eye-tracking study of second language reading assessment. Frontiers in Communication, 8, Article 1176986. https://doi.org/10.3389/fcomm.2023.1176986</w:t>
       </w:r>
     </w:p>
     <w:p>
@@ -591,6 +621,14 @@
       </w:pPr>
       <w:r>
         <w:t>Vygotsky, L. S. (1978). Mind in society: The development of higher psychological processes. Harvard University Press.</w:t>
+      </w:r>
+    </w:p>
+    <w:p>
+      <w:pPr>
+        <w:ind w:left="360" w:hanging="360"/>
+      </w:pPr>
+      <w:r>
+        <w:t>Zhang, J., &amp; Lu, X. (2019). Measuring and supporting second language development using computerized dynamic assessment. Language and Sociocultural Theory, 6(1), 92–115. https://doi.org/10.1558/lst.31710</w:t>
       </w:r>
     </w:p>
     <w:sectPr>

</xml_diff>